<commit_message>
Rà soát tờ trình (nhóm B): chỉnh trích dẫn NĐ 332, NĐ 333, NĐ 330 Đ56.3, NQ 22; tạo lại Word
Co-Authored-By: Claude Opus 5.5 <noreply@anthropic.com>
Claude-Session: https://claude.ai/code/session_01EYfrLZFALxho7iwpK7bTVa
</commit_message>
<xml_diff>
--- a/templates/07-to-trinh-lanh-dao/to-trinh-ke-hoach-dao-tao-dien-tap.docx
+++ b/templates/07-to-trinh-lanh-dao/to-trinh-ke-hoach-dao-tao-dien-tap.docx
@@ -713,7 +713,7 @@
           <w:sz w:val="26"/>
           <w:szCs w:val="26"/>
         </w:rPr>
-        <w:t xml:space="preserve">a) Chủ quản HTTT chỉ đạo tổ chức tuyên truyền, nâng cao nhận thức về ANM và thường xuyên bồi dưỡng, cập nhật kỹ năng cho nhân sự liên quan, gồm: đào tạo ngắn hạn cho người làm về ANM; tuyên truyền, phổ biến cho người trong tổ chức; diễn tập bảo đảm ANM trong tổ chức; tham gia diễn tập quốc gia và quốc tế do Bộ Công an tổ chức (NĐ 331 Đ31.3). Tổ chức tuyên truyền, nâng cao nhận thức là một nhiệm vụ bảo vệ ANM đối với HTTT (Luật 116 Đ10.1.e).</w:t>
+        <w:t xml:space="preserve">a) Chủ quản HTTT chỉ đạo tổ chức tuyên truyền, nâng cao nhận thức về ANM và thường xuyên bồi dưỡng, cập nhật kỹ năng cho nhân sự liên quan, gồm: đào tạo ngắn hạn cho cán bộ, công chức, viên chức làm về ANM; tuyên truyền, phổ biến cho cán bộ, công chức, viên chức trong tổ chức; diễn tập bảo đảm ANM trong tổ chức; tham gia diễn tập quốc gia và quốc tế do Bộ Công an tổ chức (NĐ 331 Đ31.3). Với doanh nghiệp, các nội dung này áp dụng tương ứng cho người lao động. Tổ chức tuyên truyền, nâng cao nhận thức là một nhiệm vụ bảo vệ ANM đối với HTTT (Luật 116 Đ10.1.e). Cơ quan, tổ chức có trách nhiệm phổ biến kiến thức về ANM cho cán bộ, công chức, viên chức, người lao động của mình (Luật 116 Đ35.2).</w:t>
       </w:r>
     </w:p>
     <w:p>
@@ -2201,11 +2201,11 @@
       </w:tblPr>
       <w:tblGrid>
         <w:gridCol w:w="630"/>
-        <w:gridCol w:w="1758"/>
-        <w:gridCol w:w="2174"/>
-        <w:gridCol w:w="1421"/>
-        <w:gridCol w:w="1453"/>
-        <w:gridCol w:w="1589"/>
+        <w:gridCol w:w="1725"/>
+        <w:gridCol w:w="2122"/>
+        <w:gridCol w:w="1399"/>
+        <w:gridCol w:w="1438"/>
+        <w:gridCol w:w="1711"/>
       </w:tblGrid>
       <w:tr>
         <w:trPr>
@@ -2252,7 +2252,7 @@
         </w:tc>
         <w:tc>
           <w:tcPr>
-            <w:tcW w:type="dxa" w:w="1758"/>
+            <w:tcW w:type="dxa" w:w="1725"/>
             <w:tcBorders>
               <w:top w:val="single" w:color="000000" w:sz="4"/>
               <w:left w:val="single" w:color="000000" w:sz="4"/>
@@ -2290,7 +2290,7 @@
         </w:tc>
         <w:tc>
           <w:tcPr>
-            <w:tcW w:type="dxa" w:w="2174"/>
+            <w:tcW w:type="dxa" w:w="2122"/>
             <w:tcBorders>
               <w:top w:val="single" w:color="000000" w:sz="4"/>
               <w:left w:val="single" w:color="000000" w:sz="4"/>
@@ -2328,7 +2328,7 @@
         </w:tc>
         <w:tc>
           <w:tcPr>
-            <w:tcW w:type="dxa" w:w="1421"/>
+            <w:tcW w:type="dxa" w:w="1399"/>
             <w:tcBorders>
               <w:top w:val="single" w:color="000000" w:sz="4"/>
               <w:left w:val="single" w:color="000000" w:sz="4"/>
@@ -2366,7 +2366,7 @@
         </w:tc>
         <w:tc>
           <w:tcPr>
-            <w:tcW w:type="dxa" w:w="1453"/>
+            <w:tcW w:type="dxa" w:w="1438"/>
             <w:tcBorders>
               <w:top w:val="single" w:color="000000" w:sz="4"/>
               <w:left w:val="single" w:color="000000" w:sz="4"/>
@@ -2404,7 +2404,7 @@
         </w:tc>
         <w:tc>
           <w:tcPr>
-            <w:tcW w:type="dxa" w:w="1589"/>
+            <w:tcW w:type="dxa" w:w="1711"/>
             <w:tcBorders>
               <w:top w:val="single" w:color="000000" w:sz="4"/>
               <w:left w:val="single" w:color="000000" w:sz="4"/>
@@ -2485,7 +2485,7 @@
         </w:tc>
         <w:tc>
           <w:tcPr>
-            <w:tcW w:type="dxa" w:w="1758"/>
+            <w:tcW w:type="dxa" w:w="1725"/>
             <w:tcBorders>
               <w:top w:val="single" w:color="000000" w:sz="4"/>
               <w:left w:val="single" w:color="000000" w:sz="4"/>
@@ -2522,7 +2522,7 @@
         </w:tc>
         <w:tc>
           <w:tcPr>
-            <w:tcW w:type="dxa" w:w="2174"/>
+            <w:tcW w:type="dxa" w:w="2122"/>
             <w:tcBorders>
               <w:top w:val="single" w:color="000000" w:sz="4"/>
               <w:left w:val="single" w:color="000000" w:sz="4"/>
@@ -2559,7 +2559,7 @@
         </w:tc>
         <w:tc>
           <w:tcPr>
-            <w:tcW w:type="dxa" w:w="1421"/>
+            <w:tcW w:type="dxa" w:w="1399"/>
             <w:tcBorders>
               <w:top w:val="single" w:color="000000" w:sz="4"/>
               <w:left w:val="single" w:color="000000" w:sz="4"/>
@@ -2596,7 +2596,7 @@
         </w:tc>
         <w:tc>
           <w:tcPr>
-            <w:tcW w:type="dxa" w:w="1453"/>
+            <w:tcW w:type="dxa" w:w="1438"/>
             <w:tcBorders>
               <w:top w:val="single" w:color="000000" w:sz="4"/>
               <w:left w:val="single" w:color="000000" w:sz="4"/>
@@ -2634,7 +2634,7 @@
         </w:tc>
         <w:tc>
           <w:tcPr>
-            <w:tcW w:type="dxa" w:w="1589"/>
+            <w:tcW w:type="dxa" w:w="1711"/>
             <w:tcBorders>
               <w:top w:val="single" w:color="000000" w:sz="4"/>
               <w:left w:val="single" w:color="000000" w:sz="4"/>
@@ -2665,7 +2665,7 @@
                 <w:sz w:val="20"/>
                 <w:szCs w:val="20"/>
               </w:rPr>
-              <w:t xml:space="preserve">NĐ 331 Đ31.3; TCVN 5.14</w:t>
+              <w:t xml:space="preserve">NĐ 331 Đ31.3; Luật 116 Đ35.2; TCVN 5.14</w:t>
             </w:r>
           </w:p>
         </w:tc>
@@ -2714,7 +2714,7 @@
         </w:tc>
         <w:tc>
           <w:tcPr>
-            <w:tcW w:type="dxa" w:w="1758"/>
+            <w:tcW w:type="dxa" w:w="1725"/>
             <w:tcBorders>
               <w:top w:val="single" w:color="000000" w:sz="4"/>
               <w:left w:val="single" w:color="000000" w:sz="4"/>
@@ -2751,7 +2751,7 @@
         </w:tc>
         <w:tc>
           <w:tcPr>
-            <w:tcW w:type="dxa" w:w="2174"/>
+            <w:tcW w:type="dxa" w:w="2122"/>
             <w:tcBorders>
               <w:top w:val="single" w:color="000000" w:sz="4"/>
               <w:left w:val="single" w:color="000000" w:sz="4"/>
@@ -2788,7 +2788,7 @@
         </w:tc>
         <w:tc>
           <w:tcPr>
-            <w:tcW w:type="dxa" w:w="1421"/>
+            <w:tcW w:type="dxa" w:w="1399"/>
             <w:tcBorders>
               <w:top w:val="single" w:color="000000" w:sz="4"/>
               <w:left w:val="single" w:color="000000" w:sz="4"/>
@@ -2825,7 +2825,7 @@
         </w:tc>
         <w:tc>
           <w:tcPr>
-            <w:tcW w:type="dxa" w:w="1453"/>
+            <w:tcW w:type="dxa" w:w="1438"/>
             <w:tcBorders>
               <w:top w:val="single" w:color="000000" w:sz="4"/>
               <w:left w:val="single" w:color="000000" w:sz="4"/>
@@ -2863,7 +2863,7 @@
         </w:tc>
         <w:tc>
           <w:tcPr>
-            <w:tcW w:type="dxa" w:w="1589"/>
+            <w:tcW w:type="dxa" w:w="1711"/>
             <w:tcBorders>
               <w:top w:val="single" w:color="000000" w:sz="4"/>
               <w:left w:val="single" w:color="000000" w:sz="4"/>
@@ -2943,7 +2943,7 @@
         </w:tc>
         <w:tc>
           <w:tcPr>
-            <w:tcW w:type="dxa" w:w="1758"/>
+            <w:tcW w:type="dxa" w:w="1725"/>
             <w:tcBorders>
               <w:top w:val="single" w:color="000000" w:sz="4"/>
               <w:left w:val="single" w:color="000000" w:sz="4"/>
@@ -2980,7 +2980,7 @@
         </w:tc>
         <w:tc>
           <w:tcPr>
-            <w:tcW w:type="dxa" w:w="2174"/>
+            <w:tcW w:type="dxa" w:w="2122"/>
             <w:tcBorders>
               <w:top w:val="single" w:color="000000" w:sz="4"/>
               <w:left w:val="single" w:color="000000" w:sz="4"/>
@@ -3017,7 +3017,7 @@
         </w:tc>
         <w:tc>
           <w:tcPr>
-            <w:tcW w:type="dxa" w:w="1421"/>
+            <w:tcW w:type="dxa" w:w="1399"/>
             <w:tcBorders>
               <w:top w:val="single" w:color="000000" w:sz="4"/>
               <w:left w:val="single" w:color="000000" w:sz="4"/>
@@ -3054,7 +3054,7 @@
         </w:tc>
         <w:tc>
           <w:tcPr>
-            <w:tcW w:type="dxa" w:w="1453"/>
+            <w:tcW w:type="dxa" w:w="1438"/>
             <w:tcBorders>
               <w:top w:val="single" w:color="000000" w:sz="4"/>
               <w:left w:val="single" w:color="000000" w:sz="4"/>
@@ -3092,7 +3092,7 @@
         </w:tc>
         <w:tc>
           <w:tcPr>
-            <w:tcW w:type="dxa" w:w="1589"/>
+            <w:tcW w:type="dxa" w:w="1711"/>
             <w:tcBorders>
               <w:top w:val="single" w:color="000000" w:sz="4"/>
               <w:left w:val="single" w:color="000000" w:sz="4"/>
@@ -3172,7 +3172,7 @@
         </w:tc>
         <w:tc>
           <w:tcPr>
-            <w:tcW w:type="dxa" w:w="1758"/>
+            <w:tcW w:type="dxa" w:w="1725"/>
             <w:tcBorders>
               <w:top w:val="single" w:color="000000" w:sz="4"/>
               <w:left w:val="single" w:color="000000" w:sz="4"/>
@@ -3209,7 +3209,7 @@
         </w:tc>
         <w:tc>
           <w:tcPr>
-            <w:tcW w:type="dxa" w:w="2174"/>
+            <w:tcW w:type="dxa" w:w="2122"/>
             <w:tcBorders>
               <w:top w:val="single" w:color="000000" w:sz="4"/>
               <w:left w:val="single" w:color="000000" w:sz="4"/>
@@ -3246,7 +3246,7 @@
         </w:tc>
         <w:tc>
           <w:tcPr>
-            <w:tcW w:type="dxa" w:w="1421"/>
+            <w:tcW w:type="dxa" w:w="1399"/>
             <w:tcBorders>
               <w:top w:val="single" w:color="000000" w:sz="4"/>
               <w:left w:val="single" w:color="000000" w:sz="4"/>
@@ -3283,7 +3283,7 @@
         </w:tc>
         <w:tc>
           <w:tcPr>
-            <w:tcW w:type="dxa" w:w="1453"/>
+            <w:tcW w:type="dxa" w:w="1438"/>
             <w:tcBorders>
               <w:top w:val="single" w:color="000000" w:sz="4"/>
               <w:left w:val="single" w:color="000000" w:sz="4"/>
@@ -3321,7 +3321,7 @@
         </w:tc>
         <w:tc>
           <w:tcPr>
-            <w:tcW w:type="dxa" w:w="1589"/>
+            <w:tcW w:type="dxa" w:w="1711"/>
             <w:tcBorders>
               <w:top w:val="single" w:color="000000" w:sz="4"/>
               <w:left w:val="single" w:color="000000" w:sz="4"/>
@@ -3401,7 +3401,7 @@
         </w:tc>
         <w:tc>
           <w:tcPr>
-            <w:tcW w:type="dxa" w:w="1758"/>
+            <w:tcW w:type="dxa" w:w="1725"/>
             <w:tcBorders>
               <w:top w:val="single" w:color="000000" w:sz="4"/>
               <w:left w:val="single" w:color="000000" w:sz="4"/>
@@ -3438,7 +3438,7 @@
         </w:tc>
         <w:tc>
           <w:tcPr>
-            <w:tcW w:type="dxa" w:w="2174"/>
+            <w:tcW w:type="dxa" w:w="2122"/>
             <w:tcBorders>
               <w:top w:val="single" w:color="000000" w:sz="4"/>
               <w:left w:val="single" w:color="000000" w:sz="4"/>
@@ -3475,7 +3475,7 @@
         </w:tc>
         <w:tc>
           <w:tcPr>
-            <w:tcW w:type="dxa" w:w="1421"/>
+            <w:tcW w:type="dxa" w:w="1399"/>
             <w:tcBorders>
               <w:top w:val="single" w:color="000000" w:sz="4"/>
               <w:left w:val="single" w:color="000000" w:sz="4"/>
@@ -3512,7 +3512,7 @@
         </w:tc>
         <w:tc>
           <w:tcPr>
-            <w:tcW w:type="dxa" w:w="1453"/>
+            <w:tcW w:type="dxa" w:w="1438"/>
             <w:tcBorders>
               <w:top w:val="single" w:color="000000" w:sz="4"/>
               <w:left w:val="single" w:color="000000" w:sz="4"/>
@@ -3550,7 +3550,7 @@
         </w:tc>
         <w:tc>
           <w:tcPr>
-            <w:tcW w:type="dxa" w:w="1589"/>
+            <w:tcW w:type="dxa" w:w="1711"/>
             <w:tcBorders>
               <w:top w:val="single" w:color="000000" w:sz="4"/>
               <w:left w:val="single" w:color="000000" w:sz="4"/>
@@ -3630,7 +3630,7 @@
         </w:tc>
         <w:tc>
           <w:tcPr>
-            <w:tcW w:type="dxa" w:w="1758"/>
+            <w:tcW w:type="dxa" w:w="1725"/>
             <w:tcBorders>
               <w:top w:val="single" w:color="000000" w:sz="4"/>
               <w:left w:val="single" w:color="000000" w:sz="4"/>
@@ -3667,7 +3667,7 @@
         </w:tc>
         <w:tc>
           <w:tcPr>
-            <w:tcW w:type="dxa" w:w="2174"/>
+            <w:tcW w:type="dxa" w:w="2122"/>
             <w:tcBorders>
               <w:top w:val="single" w:color="000000" w:sz="4"/>
               <w:left w:val="single" w:color="000000" w:sz="4"/>
@@ -3704,7 +3704,7 @@
         </w:tc>
         <w:tc>
           <w:tcPr>
-            <w:tcW w:type="dxa" w:w="1421"/>
+            <w:tcW w:type="dxa" w:w="1399"/>
             <w:tcBorders>
               <w:top w:val="single" w:color="000000" w:sz="4"/>
               <w:left w:val="single" w:color="000000" w:sz="4"/>
@@ -3741,7 +3741,7 @@
         </w:tc>
         <w:tc>
           <w:tcPr>
-            <w:tcW w:type="dxa" w:w="1453"/>
+            <w:tcW w:type="dxa" w:w="1438"/>
             <w:tcBorders>
               <w:top w:val="single" w:color="000000" w:sz="4"/>
               <w:left w:val="single" w:color="000000" w:sz="4"/>
@@ -3779,7 +3779,7 @@
         </w:tc>
         <w:tc>
           <w:tcPr>
-            <w:tcW w:type="dxa" w:w="1589"/>
+            <w:tcW w:type="dxa" w:w="1711"/>
             <w:tcBorders>
               <w:top w:val="single" w:color="000000" w:sz="4"/>
               <w:left w:val="single" w:color="000000" w:sz="4"/>
@@ -3859,7 +3859,7 @@
         </w:tc>
         <w:tc>
           <w:tcPr>
-            <w:tcW w:type="dxa" w:w="1758"/>
+            <w:tcW w:type="dxa" w:w="1725"/>
             <w:tcBorders>
               <w:top w:val="single" w:color="000000" w:sz="4"/>
               <w:left w:val="single" w:color="000000" w:sz="4"/>
@@ -3896,7 +3896,7 @@
         </w:tc>
         <w:tc>
           <w:tcPr>
-            <w:tcW w:type="dxa" w:w="2174"/>
+            <w:tcW w:type="dxa" w:w="2122"/>
             <w:tcBorders>
               <w:top w:val="single" w:color="000000" w:sz="4"/>
               <w:left w:val="single" w:color="000000" w:sz="4"/>
@@ -3933,7 +3933,7 @@
         </w:tc>
         <w:tc>
           <w:tcPr>
-            <w:tcW w:type="dxa" w:w="1421"/>
+            <w:tcW w:type="dxa" w:w="1399"/>
             <w:tcBorders>
               <w:top w:val="single" w:color="000000" w:sz="4"/>
               <w:left w:val="single" w:color="000000" w:sz="4"/>
@@ -3970,7 +3970,7 @@
         </w:tc>
         <w:tc>
           <w:tcPr>
-            <w:tcW w:type="dxa" w:w="1453"/>
+            <w:tcW w:type="dxa" w:w="1438"/>
             <w:tcBorders>
               <w:top w:val="single" w:color="000000" w:sz="4"/>
               <w:left w:val="single" w:color="000000" w:sz="4"/>
@@ -4008,7 +4008,7 @@
         </w:tc>
         <w:tc>
           <w:tcPr>
-            <w:tcW w:type="dxa" w:w="1589"/>
+            <w:tcW w:type="dxa" w:w="1711"/>
             <w:tcBorders>
               <w:top w:val="single" w:color="000000" w:sz="4"/>
               <w:left w:val="single" w:color="000000" w:sz="4"/>

</xml_diff>